<commit_message>
fix(q2): add scenario 4 batched Monte Carlo validation
</commit_message>
<xml_diff>
--- a/建模文件/2024国赛B题_问题二建模手册_闭环状态决策模型.docx
+++ b/建模文件/2024国赛B题_问题二建模手册_闭环状态决策模型.docx
@@ -9952,7 +9952,27 @@
           <w:rFonts w:ascii="Times New Roman" w:hAnsi="Times New Roman" w:eastAsia="Noto Serif CJK SC"/>
           <w:sz w:val="21"/>
         </w:rPr>
-        <w:t>对每种情形的最优策略模拟完整客户订单。每次订单从采购开始，逐个生成零件质量、装配结果、成品检测/市场反馈、拆解/报废与再投入，直到客户拿到合格成品。建议至少10⁵笔订单，并报告样本均值、标准误与95%置信区间。理论期望利润应落入模拟均值95%置信区间；同时比较采购次数、装配次数、调换次数、拆解次数的理论期望和模拟均值，避免“总利润偶然对上但内部流程错了”。</w:t>
+        <w:t>对每种情形的最优策略模拟完整客户订单。每次订单从采购开始，逐个生成零件质量、装配结果、成品检测/市场反馈、拆解/报废与再投入，直到客户拿到合格成品。每种情形先固定随机种子模拟10⁵笔订单，报告样本均值、标准误、95%置信区间和z-score，并同步比较六类成本及采购、装配、调换、拆解等事件次数。单次95%置信区间存在约5%的漏覆盖概率，因此不能把是否覆盖理论值作为唯一判据；应与解析退化、Bellman残差、吸收性和事件级期望共同判断。</w:t>
+      </w:r>
+    </w:p>
+    <w:p>
+      <w:pPr/>
+      <w:r>
+        <w:rPr>
+          <w:rFonts w:ascii="Times New Roman" w:hAnsi="Times New Roman" w:eastAsia="Noto Serif CJK SC"/>
+          <w:sz w:val="21"/>
+        </w:rPr>
+        <w:t>针对情形4策略1111的原单次区间漏覆盖现象，在不更换种子追求“通过”、不修改理论值及原结果的前提下，预先固定seed=1,2,…,10，增加10个独立批次、每批10⁵笔订单的交叉验证。重点检查各批利润及z-score是否围绕理论利润14.75上下随机波动，并核对零件1、零件2平均采购次数和平均装配次数是否围绕理论值1.25波动；只有多个批次持续同方向偏离时，才进一步检查仿真实现。</w:t>
+      </w:r>
+    </w:p>
+    <w:p>
+      <w:pPr/>
+      <w:r>
+        <w:rPr>
+          <w:rFonts w:ascii="Times New Roman" w:hAnsi="Times New Roman" w:eastAsia="Noto Serif CJK SC"/>
+          <w:sz w:val="21"/>
+        </w:rPr>
+        <w:t>程序新增输出validation_mc_batches_scenario4.csv（batch、seed、n_sim、理论/模拟利润、标准误、95%区间、z-score、六类成本及三个关键事件次数）和validation_mc_batches_summary_scenario4.csv（批次数、每批规模、总模拟量、批次均值、批次间标准差/标准误、偏差、|z|及覆盖率）。MATLAB仅读取这两份Python输出CSV绘制批次误差棒与z-score两联图，不在绘图端重新模拟。</w:t>
       </w:r>
     </w:p>
     <w:p>
@@ -15659,7 +15679,7 @@
           <w:rFonts w:ascii="Times New Roman" w:hAnsi="Times New Roman" w:eastAsia="Noto Serif CJK SC"/>
           <w:sz w:val="21"/>
         </w:rPr>
-        <w:t>模型检验采用三层结构。第一层为解析一致性：关闭拆解后，Bellman模型必须严格退化为几何分布闭式成本；第二层为结果复现：六情形单位利润与参考优秀论文解析结果在两位小数上一致；第三层为随机仿真：对最优策略进行10⁵笔订单的离散事件模拟，理论期望应落入模拟95%置信区间。三种检验分别对应“公式是否正确、程序是否实现正确、随机过程是否符合理论”。</w:t>
+        <w:t>模型检验采用三层结构。第一层为解析一致性：关闭拆解后，Bellman模型必须严格退化为几何分布闭式成本；第二层为结果复现：六情形单位利润与参考优秀论文解析结果在两位小数上一致；第三层为随机仿真：先对六种最优策略分别进行10⁵笔订单模拟，再针对情形4采用10×10⁵的预设独立批次复核。随机层不以单次95%置信区间覆盖作为唯一判据，而综合批次均值、z-score方向、成本分解和事件次数判断。三种检验分别对应“公式是否正确、程序是否实现正确、随机过程是否符合理论”。</w:t>
       </w:r>
     </w:p>
     <w:p>

</xml_diff>